<commit_message>
Corregir en el código y el informe las afirmaciones falsas de la revisión
- graficas.py: el docstring ya no dice que es el único módulo con matplotlib.
- main.py: la barra de estado explica el dato inválido en lugar de quedarse
  en «Entrenando...»; la pestaña del ejemplo muestra S4 = 17,31522 y
  S5 = −23,91495, como imprime el programa, y el redondeo de las diapositivas.
- experimentos.py: el mismo ajuste en el docstring de ejecutar_ejemplo_clase.
- Informe: cuatro frases corregidas (matplotlib, exponencial en Solapadas,
  ECM frente a mínimos cuadrados y barajado del ejemplo), sin cambiar la
  paginación (52 páginas, índice igual).
- App de estudio y CLAUDE.md actualizados.

Co-Authored-By: Claude Opus 5.5 <noreply@anthropic.com>
</commit_message>
<xml_diff>
--- a/Informe_Perceptron_Carlos_Gomez_Murcia.docx
+++ b/Informe_Perceptron_Carlos_Gomez_Murcia.docx
@@ -8264,7 +8264,7 @@
         <w:t xml:space="preserve">ajustar</w:t>
       </w:r>
       <w:r>
-        <w:t xml:space="preserve"> a cada una y guarda los pesos después de cada instancia, de modo que la gráfica de pesos muestra cada corrección individual. Al terminar la época recorre de nuevo todo el conjunto con los pesos ya ajustados y calcula el error F7, que es el valor que se registra en la gráfica de épocas. El barajado evita que el orden de los datos, que se generan agrupados por clase, condicione el recorrido del plano, y puede desactivarse para reproducir exactamente el ejemplo de las diapositivas.</w:t>
+        <w:t xml:space="preserve"> a cada una y guarda los pesos después de cada instancia, de modo que la gráfica de pesos muestra cada corrección individual. Al terminar la época recorre de nuevo todo el conjunto con los pesos ya ajustados y calcula el error F7, que es el valor que se registra en la gráfica de épocas. El barajado evita que el orden de los datos, que se generan agrupados por clase, condicione el recorrido del plano, y puede desactivarse, como en el ejemplo de las diapositivas, para respetar su orden exacto.</w:t>
       </w:r>
     </w:p>
     <w:p>
@@ -9127,7 +9127,7 @@
         <w:t xml:space="preserve">graficas.py</w:t>
       </w:r>
       <w:r>
-        <w:t xml:space="preserve">, que es el único módulo con matplotlib y que solo recibe valores ya calculados con </w:t>
+        <w:t xml:space="preserve">, el módulo que dibuja con matplotlib y que solo recibe valores ya calculados con </w:t>
       </w:r>
       <w:r>
         <w:rPr>
@@ -12806,7 +12806,7 @@
         <w:ind w:firstLine="720"/>
       </w:pPr>
       <w:r>
-        <w:t xml:space="preserve">Para llevar el perceptrón a su límite se usó el escenario Solapadas, con centros en (2, 2, 2) y (3; 2; 2,5), desviación 1,5 y una distribución exponencial en la segunda clase, cuya cola larga invade la región de la primera. En estas condiciones no existe un plano separador y el resultado coincide con lo que predice la teoría: el perceptrón llegó a las 100 épocas sin converger y quedó con una exactitud del 61,5 %, de 69 % para la clase 1 y 54 % para la clase 2. La Figura 6 muestra la mezcla de las nubes y la Figura 7 muestra el error por época, que oscila entre aproximadamente 130 y 200 sin ninguna tendencia, porque cada corrección que arregla una instancia desarregla otras.</w:t>
+        <w:t xml:space="preserve">Para llevar el perceptrón a su límite se usó el escenario Solapadas, con centros en (2, 2, 2) y (3; 2; 2,5), desviación 1,5 y una distribución exponencial en la segunda clase, cuyos puntos se acumulan cerca de su mínimo e invaden la región de la primera. En estas condiciones no existe un plano separador y el resultado coincide con lo que predice la teoría: el perceptrón llegó a las 100 épocas sin converger y quedó con una exactitud del 61,5 %, de 69 % para la clase 1 y 54 % para la clase 2. La Figura 6 muestra la mezcla de las nubes y la Figura 7 muestra el error por época, que oscila entre aproximadamente 130 y 200 sin ninguna tendencia, porque cada corrección que arregla una instancia desarregla otras.</w:t>
       </w:r>
     </w:p>
     <w:p>
@@ -15378,7 +15378,7 @@
         <w:t xml:space="preserve">3</w:t>
       </w:r>
       <w:r>
-        <w:t xml:space="preserve"> + 3 más un ruido normal de desviación 1. El error se estabilizó en 265 épocas, es decir, dejó de mejorar según el criterio de estancamiento, con un error cuadrático medio de 1,076 y un coeficiente de determinación (F19) de 0,964. Como muestra la Tabla 8, los pesos aprendidos son muy cercanos a los coeficientes reales, y el ECM es prácticamente igual a la varianza del ruido, que es el menor error que puede alcanzar cualquier modelo lineal con estos datos.</w:t>
+        <w:t xml:space="preserve"> + 3 más un ruido normal de desviación 1. El error se estabilizó en 265 épocas, es decir, dejó de mejorar según el criterio de estancamiento, con un error cuadrático medio de 1,076 y un coeficiente de determinación (F19) de 0,964. Como muestra la Tabla 8, los pesos aprendidos son muy cercanos a los coeficientes reales, y el ECM es prácticamente igual a la varianza del ruido, y muy cercano al del mejor plano posible, el de mínimos cuadrados, que da 1,063.</w:t>
       </w:r>
     </w:p>
     <w:p>

</xml_diff>